<commit_message>
Read DISC style names from the report and add Graph Shift Radar
- Roadmap style labels use Maxwell's style name from the report's
  "Style:" line (e.g. "CSD Contemplator") instead of the Flywheel
  reference name; older profiles fall back to the reference name.
- The DISC Leadership Roadmap Connection paragraph is generated per
  person. It was never tokenized, so every booklet printed the reference
  participant's "Your CS pattern..." regardless of style.
- Individual Results tab gains a Graph Shift Radar that overlays one
  participant's Public, Stress and Mirror graphs, with per-graph toggles.
  The radar's shared layout is factored out of the comparison chart.

Co-Authored-By: Claude Opus 5.5 <noreply@anthropic.com>
</commit_message>
<xml_diff>
--- a/sdg_disc_dash/utils/roadmap_template.docx
+++ b/sdg_disc_dash/utils/roadmap_template.docx
@@ -6111,159 +6111,7 @@
           <w:sz w:val="24"/>
           <w:szCs w:val="24"/>
         </w:rPr>
-        <w:t xml:space="preserve">DISC helps </w:t>
-      </w:r>
-      <w:r>
-        <w:rPr>
-          <w:color w:val="202631"/>
-          <w:sz w:val="24"/>
-          <w:szCs w:val="24"/>
-        </w:rPr>
-        <w:t xml:space="preserve">you </w:t>
-      </w:r>
-      <w:r>
-        <w:rPr>
-          <w:color w:val="202631"/>
-          <w:sz w:val="24"/>
-          <w:szCs w:val="24"/>
-        </w:rPr>
-        <w:t xml:space="preserve">understand how </w:t>
-      </w:r>
-      <w:r>
-        <w:rPr>
-          <w:color w:val="202631"/>
-          <w:sz w:val="24"/>
-          <w:szCs w:val="24"/>
-        </w:rPr>
-        <w:t xml:space="preserve">your </w:t>
-      </w:r>
-      <w:r>
-        <w:rPr>
-          <w:color w:val="202631"/>
-          <w:sz w:val="24"/>
-          <w:szCs w:val="24"/>
-        </w:rPr>
-        <w:t>leadership behavior is likely experienced by s</w:t>
-      </w:r>
-      <w:r>
-        <w:rPr>
-          <w:color w:val="202631"/>
-          <w:sz w:val="24"/>
-          <w:szCs w:val="24"/>
-        </w:rPr>
-        <w:t>taff</w:t>
-      </w:r>
-      <w:r>
-        <w:rPr>
-          <w:color w:val="202631"/>
-          <w:sz w:val="24"/>
-          <w:szCs w:val="24"/>
-        </w:rPr>
-        <w:t xml:space="preserve"> and what may shift when pressure rises.</w:t>
-      </w:r>
-      <w:r>
-        <w:rPr>
-          <w:color w:val="202631"/>
-          <w:sz w:val="24"/>
-          <w:szCs w:val="24"/>
-        </w:rPr>
-        <w:t xml:space="preserve"> Your</w:t>
-      </w:r>
-      <w:r>
-        <w:rPr>
-          <w:color w:val="202631"/>
-          <w:sz w:val="24"/>
-          <w:szCs w:val="24"/>
-        </w:rPr>
-        <w:t xml:space="preserve"> CS pattern gives </w:t>
-      </w:r>
-      <w:r>
-        <w:rPr>
-          <w:color w:val="202631"/>
-          <w:sz w:val="24"/>
-          <w:szCs w:val="24"/>
-        </w:rPr>
-        <w:t xml:space="preserve">you </w:t>
-      </w:r>
-      <w:r>
-        <w:rPr>
-          <w:color w:val="202631"/>
-          <w:sz w:val="24"/>
-          <w:szCs w:val="24"/>
-        </w:rPr>
-        <w:t xml:space="preserve">a strong foundation in </w:t>
-      </w:r>
-      <w:r>
-        <w:rPr>
-          <w:b/>
-          <w:bCs/>
-          <w:color w:val="202631"/>
-          <w:sz w:val="24"/>
-          <w:szCs w:val="24"/>
-        </w:rPr>
-        <w:t>structure,</w:t>
-      </w:r>
-      <w:r>
-        <w:rPr>
-          <w:color w:val="202631"/>
-          <w:sz w:val="24"/>
-          <w:szCs w:val="24"/>
-        </w:rPr>
-        <w:t xml:space="preserve"> </w:t>
-      </w:r>
-      <w:r>
-        <w:rPr>
-          <w:b/>
-          <w:bCs/>
-          <w:color w:val="202631"/>
-          <w:sz w:val="24"/>
-          <w:szCs w:val="24"/>
-        </w:rPr>
-        <w:t>standards</w:t>
-      </w:r>
-      <w:r>
-        <w:rPr>
-          <w:color w:val="202631"/>
-          <w:sz w:val="24"/>
-          <w:szCs w:val="24"/>
-        </w:rPr>
-        <w:t xml:space="preserve">, </w:t>
-      </w:r>
-      <w:r>
-        <w:rPr>
-          <w:b/>
-          <w:bCs/>
-          <w:color w:val="202631"/>
-          <w:sz w:val="24"/>
-          <w:szCs w:val="24"/>
-        </w:rPr>
-        <w:t>preparation</w:t>
-      </w:r>
-      <w:r>
-        <w:rPr>
-          <w:color w:val="202631"/>
-          <w:sz w:val="24"/>
-          <w:szCs w:val="24"/>
-        </w:rPr>
-        <w:t xml:space="preserve">, and </w:t>
-      </w:r>
-      <w:r>
-        <w:rPr>
-          <w:b/>
-          <w:bCs/>
-          <w:color w:val="202631"/>
-          <w:sz w:val="24"/>
-          <w:szCs w:val="24"/>
-        </w:rPr>
-        <w:t>follow-through</w:t>
-      </w:r>
-      <w:r>
-        <w:rPr>
-          <w:color w:val="202631"/>
-          <w:sz w:val="24"/>
-          <w:szCs w:val="24"/>
-        </w:rPr>
-        <w:t>. The development opportunity is to make those strengths more visible and coach others into ownership rather than carrying the standard alone.</w:t>
+        <w:t>{{DISC_CONNECTION_INTRO}}</w:t>
       </w:r>
     </w:p>
     <w:p>

</xml_diff>

<commit_message>
Make Roadmap text follow each DISC style; read all EQ-i composites
- Booklet text that was written for one C/S leader now varies by primary
  factor (30-60-90 focus and DISC column, Snapshot risk and coaching rows,
  Integration Summary value line, signature trust clause, 90-day success
  indicator), and the five DISC profile cells add a secondary-factor
  clause (16 variants instead of 4).
- Reference-participant prose still fixed in the template is tokenized:
  page-6 Leadership Signature box, Roadmap Focus, EQ purpose note, Flywheel
  development risk, and the "Make the Signature Observable" table.
- "a"/"an" before style codes; the name guard only fails on real use of
  the participant's name, so ordinary-word names no longer block output.
- EQ-i Leadership Reports: composites whose score sits on the next line
  (Self-Perception, Interpersonal) were dropped; all five now parse.

Co-Authored-By: Claude Opus 5.5 <noreply@anthropic.com>
</commit_message>
<xml_diff>
--- a/sdg_disc_dash/utils/roadmap_template.docx
+++ b/sdg_disc_dash/utils/roadmap_template.docx
@@ -3488,9 +3488,8 @@
       </w:pPr>
       <w:r>
         <w:rPr>
-          <w:b/>
           <w:color w:val="202631"/>
-          <w:sz w:val="26"/>
+          <w:sz w:val="24"/>
           <w:szCs w:val="26"/>
         </w:rPr>
         <w:t>{{SUMMARY_DISC}}</w:t>
@@ -3638,79 +3637,7 @@
                 <w:sz w:val="24"/>
                 <w:szCs w:val="24"/>
               </w:rPr>
-              <w:t xml:space="preserve">Your </w:t>
-            </w:r>
-            <w:r>
-              <w:rPr>
-                <w:color w:val="202631"/>
-                <w:sz w:val="24"/>
-                <w:szCs w:val="24"/>
-              </w:rPr>
-              <w:t xml:space="preserve">development focus is to move from quiet competence to visible leadership presence, stronger emotional expression, relational connection, and coaching for shared ownership. The </w:t>
-            </w:r>
-            <w:r>
-              <w:rPr>
-                <w:color w:val="202631"/>
-                <w:sz w:val="24"/>
-                <w:szCs w:val="24"/>
-              </w:rPr>
-              <w:t xml:space="preserve">Leadership </w:t>
-            </w:r>
-            <w:r>
-              <w:rPr>
-                <w:color w:val="202631"/>
-                <w:sz w:val="24"/>
-                <w:szCs w:val="24"/>
-              </w:rPr>
-              <w:t xml:space="preserve">Roadmap helps </w:t>
-            </w:r>
-            <w:r>
-              <w:rPr>
-                <w:color w:val="202631"/>
-                <w:sz w:val="24"/>
-                <w:szCs w:val="24"/>
-              </w:rPr>
-              <w:t>you</w:t>
-            </w:r>
-            <w:r>
-              <w:rPr>
-                <w:color w:val="202631"/>
-                <w:sz w:val="24"/>
-                <w:szCs w:val="24"/>
-              </w:rPr>
-              <w:t xml:space="preserve"> summarize what </w:t>
-            </w:r>
-            <w:r>
-              <w:rPr>
-                <w:color w:val="202631"/>
-                <w:sz w:val="24"/>
-                <w:szCs w:val="24"/>
-              </w:rPr>
-              <w:t xml:space="preserve">you </w:t>
-            </w:r>
-            <w:r>
-              <w:rPr>
-                <w:color w:val="202631"/>
-                <w:sz w:val="24"/>
-                <w:szCs w:val="24"/>
-              </w:rPr>
-              <w:t xml:space="preserve">have learned and confirm what is most true for </w:t>
-            </w:r>
-            <w:r>
-              <w:rPr>
-                <w:color w:val="202631"/>
-                <w:sz w:val="24"/>
-                <w:szCs w:val="24"/>
-              </w:rPr>
-              <w:t>your</w:t>
-            </w:r>
-            <w:r>
-              <w:rPr>
-                <w:color w:val="202631"/>
-                <w:sz w:val="24"/>
-                <w:szCs w:val="24"/>
-              </w:rPr>
-              <w:t xml:space="preserve"> leadership practice.</w:t>
+              <w:t>{{ROADMAP_FOCUS}}</w:t>
             </w:r>
           </w:p>
         </w:tc>
@@ -3814,7 +3741,7 @@
                 <w:sz w:val="24"/>
                 <w:szCs w:val="24"/>
               </w:rPr>
-              <w:t>I lead with precision, confidence, emotional clarity, and adaptive accountability. I build trust through high standards and authentic communication, develop people through honest coaching, and create momentum by pairing disciplined execution with visible support and clear direction</w:t>
+              <w:t>{{LEADERSHIP_SIGNATURE}}</w:t>
             </w:r>
           </w:p>
         </w:tc>
@@ -10816,63 +10743,7 @@
           <w:sz w:val="24"/>
           <w:szCs w:val="24"/>
         </w:rPr>
-        <w:t xml:space="preserve">EQ is the capacity that helps </w:t>
-      </w:r>
-      <w:r>
-        <w:rPr>
-          <w:color w:val="202631"/>
-          <w:sz w:val="24"/>
-          <w:szCs w:val="24"/>
-        </w:rPr>
-        <w:t xml:space="preserve">you </w:t>
-      </w:r>
-      <w:r>
-        <w:rPr>
-          <w:color w:val="202631"/>
-          <w:sz w:val="24"/>
-          <w:szCs w:val="24"/>
-        </w:rPr>
-        <w:t>stay steady, clear, and fair when coaching s</w:t>
-      </w:r>
-      <w:r>
-        <w:rPr>
-          <w:color w:val="202631"/>
-          <w:sz w:val="24"/>
-          <w:szCs w:val="24"/>
-        </w:rPr>
-        <w:t>taff</w:t>
-      </w:r>
-      <w:r>
-        <w:rPr>
-          <w:color w:val="202631"/>
-          <w:sz w:val="24"/>
-          <w:szCs w:val="24"/>
-        </w:rPr>
-        <w:t xml:space="preserve"> through pressure. For </w:t>
-      </w:r>
-      <w:r>
-        <w:rPr>
-          <w:color w:val="202631"/>
-          <w:sz w:val="24"/>
-          <w:szCs w:val="24"/>
-        </w:rPr>
-        <w:t>you</w:t>
-      </w:r>
-      <w:r>
-        <w:rPr>
-          <w:color w:val="202631"/>
-          <w:sz w:val="24"/>
-          <w:szCs w:val="24"/>
-        </w:rPr>
-        <w:t>, EQ bridges strong internal confidence with more visible emotional expression, relational connection, and coaching presence</w:t>
-      </w:r>
-      <w:r>
-        <w:rPr>
-          <w:color w:val="202631"/>
-          <w:sz w:val="24"/>
-          <w:szCs w:val="24"/>
-        </w:rPr>
-        <w:t>.</w:t>
+        <w:t>{{EQ_PURPOSE_NOTE}}</w:t>
       </w:r>
     </w:p>
     <w:p>
@@ -16190,51 +16061,7 @@
           <w:sz w:val="24"/>
           <w:szCs w:val="24"/>
         </w:rPr>
-        <w:t xml:space="preserve">The development risk is that strong personal execution can become </w:t>
-      </w:r>
-      <w:r>
-        <w:rPr>
-          <w:b/>
-          <w:i/>
-          <w:iCs/>
-          <w:color w:val="202631"/>
-          <w:sz w:val="24"/>
-          <w:szCs w:val="24"/>
-        </w:rPr>
-        <w:t xml:space="preserve">a </w:t>
-      </w:r>
-      <w:r>
-        <w:rPr>
-          <w:b/>
-          <w:i/>
-          <w:iCs/>
-          <w:color w:val="202631"/>
-          <w:sz w:val="24"/>
-          <w:szCs w:val="24"/>
-        </w:rPr>
-        <w:t xml:space="preserve">dependency if others are not coached into ownership. </w:t>
-      </w:r>
-      <w:r>
-        <w:rPr>
-          <w:b/>
-          <w:i/>
-          <w:iCs/>
-          <w:color w:val="202631"/>
-          <w:sz w:val="24"/>
-          <w:szCs w:val="24"/>
-        </w:rPr>
-        <w:t xml:space="preserve">Your </w:t>
-      </w:r>
-      <w:r>
-        <w:rPr>
-          <w:b/>
-          <w:i/>
-          <w:iCs/>
-          <w:color w:val="202631"/>
-          <w:sz w:val="24"/>
-          <w:szCs w:val="24"/>
-        </w:rPr>
-        <w:t>Flywheel work is to ensure standards are transferred, not just protected.</w:t>
+        <w:t>{{FLY_DEV_RISK}}</w:t>
       </w:r>
     </w:p>
     <w:p>
@@ -20973,7 +20800,7 @@
                 <w:sz w:val="24"/>
                 <w:szCs w:val="24"/>
               </w:rPr>
-              <w:t>Precision</w:t>
+              <w:t>{{SIG_EL_1}}</w:t>
             </w:r>
           </w:p>
           <w:p>
@@ -21022,7 +20849,7 @@
                 <w:sz w:val="24"/>
                 <w:szCs w:val="24"/>
               </w:rPr>
-              <w:t>You clarify expectations, standards, timelines, and follow-up.</w:t>
+              <w:t>{{SIG_OBS_1}}</w:t>
             </w:r>
           </w:p>
         </w:tc>
@@ -21069,7 +20896,7 @@
                 <w:sz w:val="24"/>
                 <w:szCs w:val="24"/>
               </w:rPr>
-              <w:t>Confidence</w:t>
+              <w:t>{{SIG_EL_2}}</w:t>
             </w:r>
           </w:p>
         </w:tc>
@@ -21108,7 +20935,7 @@
                 <w:sz w:val="24"/>
                 <w:szCs w:val="24"/>
               </w:rPr>
-              <w:t>You state what you see, why it matters, and what you recommend.</w:t>
+              <w:t>{{SIG_OBS_2}}</w:t>
             </w:r>
           </w:p>
         </w:tc>
@@ -21155,7 +20982,7 @@
                 <w:sz w:val="24"/>
                 <w:szCs w:val="24"/>
               </w:rPr>
-              <w:t>Emotional Clarity</w:t>
+              <w:t>{{SIG_EL_3}}</w:t>
             </w:r>
           </w:p>
         </w:tc>
@@ -21194,7 +21021,7 @@
                 <w:sz w:val="24"/>
                 <w:szCs w:val="24"/>
               </w:rPr>
-              <w:t>You name appreciation, concern, urgency, support, and direction more visibly.</w:t>
+              <w:t>{{SIG_OBS_3}}</w:t>
             </w:r>
           </w:p>
         </w:tc>
@@ -21241,7 +21068,7 @@
                 <w:sz w:val="24"/>
                 <w:szCs w:val="24"/>
               </w:rPr>
-              <w:t>Adaptive Accountability</w:t>
+              <w:t>{{SIG_EL_4}}</w:t>
             </w:r>
           </w:p>
         </w:tc>
@@ -21280,7 +21107,7 @@
                 <w:sz w:val="24"/>
                 <w:szCs w:val="24"/>
               </w:rPr>
-              <w:t>You maintain standards while asking questions that require ownership and learning.</w:t>
+              <w:t>{{SIG_OBS_4}}</w:t>
             </w:r>
           </w:p>
         </w:tc>
@@ -21325,7 +21152,7 @@
                 <w:sz w:val="24"/>
                 <w:szCs w:val="24"/>
               </w:rPr>
-              <w:t>Visible Support and Clear Direction</w:t>
+              <w:t>{{SIG_EL_5}}</w:t>
             </w:r>
           </w:p>
         </w:tc>
@@ -21362,35 +21189,7 @@
                 <w:sz w:val="24"/>
                 <w:szCs w:val="24"/>
               </w:rPr>
-              <w:t>S</w:t>
-            </w:r>
-            <w:r>
-              <w:rPr>
-                <w:sz w:val="24"/>
-                <w:szCs w:val="24"/>
-              </w:rPr>
-              <w:t>taff</w:t>
-            </w:r>
-            <w:r>
-              <w:rPr>
-                <w:sz w:val="24"/>
-                <w:szCs w:val="24"/>
-              </w:rPr>
-              <w:t xml:space="preserve"> know both what is expected and how </w:t>
-            </w:r>
-            <w:r>
-              <w:rPr>
-                <w:sz w:val="24"/>
-                <w:szCs w:val="24"/>
-              </w:rPr>
-              <w:t>you</w:t>
-            </w:r>
-            <w:r>
-              <w:rPr>
-                <w:sz w:val="24"/>
-                <w:szCs w:val="24"/>
-              </w:rPr>
-              <w:t xml:space="preserve"> will support their follow-through.</w:t>
+              <w:t>{{SIG_OBS_5}}</w:t>
             </w:r>
           </w:p>
         </w:tc>
@@ -27702,77 +27501,7 @@
                 <w:sz w:val="24"/>
                 <w:szCs w:val="24"/>
               </w:rPr>
-              <w:t xml:space="preserve">You </w:t>
-            </w:r>
-            <w:r>
-              <w:rPr>
-                <w:b/>
-                <w:bCs/>
-                <w:color w:val="202631"/>
-                <w:sz w:val="24"/>
-                <w:szCs w:val="24"/>
-              </w:rPr>
-              <w:t xml:space="preserve">demonstrate visible, repeatable, momentum-building leadership. </w:t>
-            </w:r>
-            <w:r>
-              <w:rPr>
-                <w:b/>
-                <w:bCs/>
-                <w:color w:val="202631"/>
-                <w:sz w:val="24"/>
-                <w:szCs w:val="24"/>
-              </w:rPr>
-              <w:t>Your</w:t>
-            </w:r>
-            <w:r>
-              <w:rPr>
-                <w:b/>
-                <w:bCs/>
-                <w:color w:val="202631"/>
-                <w:sz w:val="24"/>
-                <w:szCs w:val="24"/>
-              </w:rPr>
-              <w:t xml:space="preserve"> standards remain high, and s</w:t>
-            </w:r>
-            <w:r>
-              <w:rPr>
-                <w:b/>
-                <w:bCs/>
-                <w:color w:val="202631"/>
-                <w:sz w:val="24"/>
-                <w:szCs w:val="24"/>
-              </w:rPr>
-              <w:t>taff</w:t>
-            </w:r>
-            <w:r>
-              <w:rPr>
-                <w:b/>
-                <w:bCs/>
-                <w:color w:val="202631"/>
-                <w:sz w:val="24"/>
-                <w:szCs w:val="24"/>
-              </w:rPr>
-              <w:t xml:space="preserve"> are increasingly expected to own the work, apply feedback, and contribute to execution rather than depending on </w:t>
-            </w:r>
-            <w:r>
-              <w:rPr>
-                <w:b/>
-                <w:bCs/>
-                <w:color w:val="202631"/>
-                <w:sz w:val="24"/>
-                <w:szCs w:val="24"/>
-              </w:rPr>
-              <w:t xml:space="preserve">you </w:t>
-            </w:r>
-            <w:r>
-              <w:rPr>
-                <w:b/>
-                <w:bCs/>
-                <w:color w:val="202631"/>
-                <w:sz w:val="24"/>
-                <w:szCs w:val="24"/>
-              </w:rPr>
-              <w:t>to carry the quality burden.</w:t>
+              <w:t>{{SUCCESS_INDICATOR}}</w:t>
             </w:r>
           </w:p>
         </w:tc>

</xml_diff>